<commit_message>
docs(passeport-immo): consigner la cible fermée et finaliser le plan CIL
</commit_message>
<xml_diff>
--- a/architecture-v1/avereo-app-passeport-immo/docs/livrables/plan-action-cil.docx
+++ b/architecture-v1/avereo-app-passeport-immo/docs/livrables/plan-action-cil.docx
@@ -4861,6 +4861,16 @@
         <w:t>La Préproduction est validée par D06 le 16 octobre 2026. Son commentaire autorise le passage en production pour le périmètre examiné. La livraison courante porte sur la cible convenue et le dossier SCI, avec le candidat déjà contrôlé ; le plan CIL ne modifie pas ces octets et ne crée pas une nouvelle condition fonctionnelle pour cette livraison.</w:t>
       </w:r>
     </w:p>
+    <w:p>
+      <w:r>
+        <w:rPr>
+          <w:rFonts w:ascii="Arial" w:hAnsi="Arial"/>
+          <w:b w:val="0"/>
+          <w:color w:val="000000"/>
+        </w:rPr>
+        <w:t>Le domaine fermé, le certificat et la base dédiée sont créés. Le compte cible est confirmé et les neuf fichiers SCI sont contrôlés ; le stockage de production reste à initialiser avant toute reprise réelle.</w:t>
+      </w:r>
+    </w:p>
     <w:tbl>
       <w:tblPr>
         <w:tblW w:type="auto" w:w="0"/>
@@ -5027,7 +5037,7 @@
                 <w:color w:val="000000"/>
                 <w:sz w:val="19"/>
               </w:rPr>
-              <w:t>Qualifier domaine, TLS, runtime, base dédiée, espaces privés et isolement</w:t>
+              <w:t>Initialiser le compte SQL, le schéma et les espaces privés ; conserver le refus d’accès pendant les contrôles</w:t>
             </w:r>
           </w:p>
         </w:tc>
@@ -5055,7 +5065,7 @@
                 <w:color w:val="000000"/>
                 <w:sz w:val="19"/>
               </w:rPr>
-              <w:t>Inventaire réel, refus anonyme et constat de vacuité ou sauvegarde de l’état présent</w:t>
+              <w:t>Inventaire réel, schéma isolé et constat de vacuité ou sauvegarde de l’état présent</w:t>
             </w:r>
           </w:p>
         </w:tc>
@@ -5116,7 +5126,7 @@
                 <w:color w:val="000000"/>
                 <w:sz w:val="19"/>
               </w:rPr>
-              <w:t>Identifier le propriétaire CONNECT de production et préparer une reprise ciblée, répétable sans doublon</w:t>
+              <w:t>Stabiliser l’export final puis appliquer et rejouer la reprise ciblée pour le compte confirmé</w:t>
             </w:r>
           </w:p>
         </w:tc>
@@ -5340,7 +5350,7 @@
           <w:b w:val="0"/>
           <w:color w:val="000000"/>
         </w:rPr>
-        <w:t>Les contrôles locaux des archives et contrats sont disponibles dans le point de reprise technique. Ils ne prouvent pas l’état de la future cible. L’outillage de reprise ciblée est un prérequis de cette livraison ; son développement et ses essais peuvent avancer pendant la préparation CIL.</w:t>
+        <w:t>Les contrôles locaux des archives et contrats sont disponibles dans le point de reprise technique. L’outillage de reprise ciblée passe 35 contrôles sur des données fictives ; son application sur le dossier réel reste à effectuer. La préparation de cette livraison continue pendant le cadrage CIL.</w:t>
       </w:r>
     </w:p>
     <w:p>

</xml_diff>

<commit_message>
chore(passeport-immo): qualify closed production and SCI recovery
</commit_message>
<xml_diff>
--- a/architecture-v1/avereo-app-passeport-immo/docs/livrables/plan-action-cil.docx
+++ b/architecture-v1/avereo-app-passeport-immo/docs/livrables/plan-action-cil.docx
@@ -4868,7 +4868,7 @@
           <w:b w:val="0"/>
           <w:color w:val="000000"/>
         </w:rPr>
-        <w:t>Le domaine fermé, le certificat et la base dédiée sont créés. Le compte cible est confirmé et les neuf fichiers SCI sont contrôlés ; le stockage de production reste à initialiser avant toute reprise réelle.</w:t>
+        <w:t>Le domaine, le certificat et la base dédiée sont créés. Le candidat est installé fermé et le dossier SCI repris pour le compte confirmé, avec neuf documents et rejeu sans doublon. Les cinq droits SQL utiles, la récupération isolée des données et le retour arrière sont vérifiés. Le raccordement final est préparé et répété ; son activation et la recette authentifiée restent à terminer.</w:t>
       </w:r>
     </w:p>
     <w:tbl>
@@ -4920,7 +4920,7 @@
                 <w:color w:val="FFFFFF"/>
                 <w:sz w:val="19"/>
               </w:rPr>
-              <w:t>Prérequis actuel</w:t>
+              <w:t>Point de contrôle</w:t>
             </w:r>
           </w:p>
         </w:tc>
@@ -4948,7 +4948,7 @@
                 <w:color w:val="FFFFFF"/>
                 <w:sz w:val="19"/>
               </w:rPr>
-              <w:t>Action à terminer</w:t>
+              <w:t>Action de la livraison courante</w:t>
             </w:r>
           </w:p>
         </w:tc>
@@ -5037,7 +5037,7 @@
                 <w:color w:val="000000"/>
                 <w:sz w:val="19"/>
               </w:rPr>
-              <w:t>Initialiser le compte SQL, le schéma et les espaces privés ; conserver le refus d’accès pendant les contrôles</w:t>
+              <w:t>Maintenir le refus d’accès pendant la préparation et qualifier le sas à l’activation</w:t>
             </w:r>
           </w:p>
         </w:tc>
@@ -5065,7 +5065,7 @@
                 <w:color w:val="000000"/>
                 <w:sz w:val="19"/>
               </w:rPr>
-              <w:t>Inventaire réel, schéma isolé et constat de vacuité ou sauvegarde de l’état présent</w:t>
+              <w:t>Inventaire réel, candidat exact, contrôle HTTPS et refus d’accès</w:t>
             </w:r>
           </w:p>
         </w:tc>
@@ -5126,7 +5126,7 @@
                 <w:color w:val="000000"/>
                 <w:sz w:val="19"/>
               </w:rPr>
-              <w:t>Stabiliser l’export final puis appliquer et rejouer la reprise ciblée pour le compte confirmé</w:t>
+              <w:t>Reprise effectuée ; contrôler les parcours du compte confirmé après activation</w:t>
             </w:r>
           </w:p>
         </w:tc>
@@ -5154,7 +5154,7 @@
                 <w:color w:val="000000"/>
                 <w:sz w:val="19"/>
               </w:rPr>
-              <w:t>Correspondance des comptes et inventaire du seul bien ; contrôle des actifs, archives et empreintes</w:t>
+              <w:t>Bien, client, six actifs et trois archives, empreintes et rejeu exact</w:t>
             </w:r>
           </w:p>
         </w:tc>
@@ -5215,7 +5215,7 @@
                 <w:color w:val="000000"/>
                 <w:sz w:val="19"/>
               </w:rPr>
-              <w:t>Préserver les seuls éléments CONNECT touchés puis sauvegarder les données et fichiers repris</w:t>
+              <w:t>Préserver les copies qualifiées et en reprendre une fraîche avant activation</w:t>
             </w:r>
           </w:p>
         </w:tc>
@@ -5243,7 +5243,7 @@
                 <w:color w:val="000000"/>
                 <w:sz w:val="19"/>
               </w:rPr>
-              <w:t>Restauration isolée vérifiée et copie fraîche avant écriture</w:t>
+              <w:t>Quatre tables et neuf fichiers restaurés isolément ; éléments CONNECT préservés</w:t>
             </w:r>
           </w:p>
         </w:tc>
@@ -5304,7 +5304,7 @@
                 <w:color w:val="000000"/>
                 <w:sz w:val="19"/>
               </w:rPr>
-              <w:t>Qualifier fermeture, restauration des éléments concernés et préservation des nouvelles données</w:t>
+              <w:t>Conserver fermeture et restauration ciblée sans perte des nouvelles données</w:t>
             </w:r>
           </w:p>
         </w:tc>
@@ -5350,7 +5350,24 @@
           <w:b w:val="0"/>
           <w:color w:val="000000"/>
         </w:rPr>
-        <w:t>Les contrôles locaux des archives et contrats sont disponibles dans le point de reprise technique. L’outillage de reprise ciblée passe 35 contrôles sur des données fictives ; son application sur le dossier réel reste à effectuer. La préparation de cette livraison continue pendant le cadrage CIL.</w:t>
+        <w:t xml:space="preserve">Le </w:t>
+      </w:r>
+      <w:hyperlink r:id="rId11">
+        <w:r>
+          <w:rPr>
+            <w:color w:val="1D4E63"/>
+            <w:u w:val="single"/>
+          </w:rPr>
+          <w:t>dossier de production</w:t>
+        </w:r>
+      </w:hyperlink>
+      <w:r>
+        <w:rPr>
+          <w:rFonts w:ascii="Arial" w:hAnsi="Arial"/>
+          <w:b w:val="0"/>
+          <w:color w:val="000000"/>
+        </w:rPr>
+        <w:t xml:space="preserve"> conserve l’avancement et la prochaine action. Le plan CIL reste une proposition pour l’itération suivante.</w:t>
       </w:r>
     </w:p>
     <w:p>
@@ -6141,7 +6158,7 @@
         <w:pStyle w:val="ListBullet"/>
         <w:spacing w:after="80"/>
       </w:pPr>
-      <w:hyperlink r:id="rId11">
+      <w:hyperlink r:id="rId12">
         <w:r>
           <w:rPr>
             <w:color w:val="1D4E63"/>
@@ -6164,7 +6181,7 @@
         <w:pStyle w:val="ListBullet"/>
         <w:spacing w:after="80"/>
       </w:pPr>
-      <w:hyperlink r:id="rId12">
+      <w:hyperlink r:id="rId13">
         <w:r>
           <w:rPr>
             <w:color w:val="1D4E63"/>
@@ -6187,7 +6204,7 @@
         <w:pStyle w:val="ListBullet"/>
         <w:spacing w:after="80"/>
       </w:pPr>
-      <w:hyperlink r:id="rId13">
+      <w:hyperlink r:id="rId14">
         <w:r>
           <w:rPr>
             <w:color w:val="1D4E63"/>
@@ -6210,7 +6227,7 @@
         <w:pStyle w:val="ListBullet"/>
         <w:spacing w:after="80"/>
       </w:pPr>
-      <w:hyperlink r:id="rId14">
+      <w:hyperlink r:id="rId15">
         <w:r>
           <w:rPr>
             <w:color w:val="1D4E63"/>
@@ -6233,7 +6250,7 @@
         <w:pStyle w:val="ListBullet"/>
         <w:spacing w:after="80"/>
       </w:pPr>
-      <w:hyperlink r:id="rId15">
+      <w:hyperlink r:id="rId16">
         <w:r>
           <w:rPr>
             <w:color w:val="1D4E63"/>
@@ -6250,7 +6267,7 @@
         </w:rPr>
         <w:t xml:space="preserve"> et </w:t>
       </w:r>
-      <w:hyperlink r:id="rId16">
+      <w:hyperlink r:id="rId17">
         <w:r>
           <w:rPr>
             <w:color w:val="1D4E63"/>
@@ -6273,7 +6290,7 @@
         <w:pStyle w:val="ListBullet"/>
         <w:spacing w:after="80"/>
       </w:pPr>
-      <w:hyperlink r:id="rId17">
+      <w:hyperlink r:id="rId18">
         <w:r>
           <w:rPr>
             <w:color w:val="1D4E63"/>
@@ -6290,7 +6307,7 @@
         </w:rPr>
         <w:t xml:space="preserve"> et </w:t>
       </w:r>
-      <w:hyperlink r:id="rId18">
+      <w:hyperlink r:id="rId19">
         <w:r>
           <w:rPr>
             <w:color w:val="1D4E63"/>
@@ -6313,7 +6330,7 @@
         <w:pStyle w:val="ListBullet"/>
         <w:spacing w:after="80"/>
       </w:pPr>
-      <w:hyperlink r:id="rId19">
+      <w:hyperlink r:id="rId20">
         <w:r>
           <w:rPr>
             <w:color w:val="1D4E63"/>
@@ -6336,7 +6353,7 @@
         <w:pStyle w:val="ListBullet"/>
         <w:spacing w:after="80"/>
       </w:pPr>
-      <w:hyperlink r:id="rId20">
+      <w:hyperlink r:id="rId21">
         <w:r>
           <w:rPr>
             <w:color w:val="1D4E63"/>
@@ -6353,7 +6370,7 @@
         </w:rPr>
         <w:t xml:space="preserve">, </w:t>
       </w:r>
-      <w:hyperlink r:id="rId21">
+      <w:hyperlink r:id="rId11">
         <w:r>
           <w:rPr>
             <w:color w:val="1D4E63"/>

</xml_diff>

<commit_message>
chore(passeport-immo): consigner la recette privee et le blocage OAuth
</commit_message>
<xml_diff>
--- a/architecture-v1/avereo-app-passeport-immo/docs/livrables/plan-action-cil.docx
+++ b/architecture-v1/avereo-app-passeport-immo/docs/livrables/plan-action-cil.docx
@@ -4868,7 +4868,24 @@
           <w:b w:val="0"/>
           <w:color w:val="000000"/>
         </w:rPr>
-        <w:t>Le domaine, le certificat et la base dédiée sont créés. Le candidat est installé fermé et le dossier SCI repris pour le compte confirmé, avec neuf documents et rejeu sans doublon. Les cinq droits SQL utiles, la récupération isolée des données et le retour arrière sont vérifiés. Le raccordement final est préparé et répété ; son activation et la recette authentifiée restent à terminer.</w:t>
+        <w:t xml:space="preserve">Le </w:t>
+      </w:r>
+      <w:hyperlink r:id="rId11">
+        <w:r>
+          <w:rPr>
+            <w:color w:val="1D4E63"/>
+            <w:u w:val="single"/>
+          </w:rPr>
+          <w:t>dossier de production</w:t>
+        </w:r>
+      </w:hyperlink>
+      <w:r>
+        <w:rPr>
+          <w:rFonts w:ascii="Arial" w:hAnsi="Arial"/>
+          <w:b w:val="0"/>
+          <w:color w:val="000000"/>
+        </w:rPr>
+        <w:t xml:space="preserve"> rassemble l’état réel de la cible, les reçus de reprise SCI, la récupération, l’activation et la recette CONNECT. Les constats datés distinguent la livraison technique de la validation du parcours authentifié. Ce tableau rappelle les contrôles du lot courant ; leur avancement reste dans le cockpit et le dossier de production.</w:t>
       </w:r>
     </w:p>
     <w:tbl>
@@ -5009,7 +5026,7 @@
                 <w:color w:val="000000"/>
                 <w:sz w:val="19"/>
               </w:rPr>
-              <w:t>Cible fermée</w:t>
+              <w:t>Accès privé</w:t>
             </w:r>
           </w:p>
         </w:tc>
@@ -5037,7 +5054,7 @@
                 <w:color w:val="000000"/>
                 <w:sz w:val="19"/>
               </w:rPr>
-              <w:t>Maintenir le refus d’accès pendant la préparation et qualifier le sas à l’activation</w:t>
+              <w:t>Conserver le sas signé et vérifier les refus d’accès ainsi que le parcours OAuth</w:t>
             </w:r>
           </w:p>
         </w:tc>
@@ -5065,7 +5082,7 @@
                 <w:color w:val="000000"/>
                 <w:sz w:val="19"/>
               </w:rPr>
-              <w:t>Inventaire réel, candidat exact, contrôle HTTPS et refus d’accès</w:t>
+              <w:t>Inventaire réel, candidat exact, contrôles HTTPS et authentification</w:t>
             </w:r>
           </w:p>
         </w:tc>
@@ -5126,7 +5143,7 @@
                 <w:color w:val="000000"/>
                 <w:sz w:val="19"/>
               </w:rPr>
-              <w:t>Reprise effectuée ; contrôler les parcours du compte confirmé après activation</w:t>
+              <w:t>Contrôler les parcours du compte confirmé après reprise ciblée</w:t>
             </w:r>
           </w:p>
         </w:tc>
@@ -5215,7 +5232,7 @@
                 <w:color w:val="000000"/>
                 <w:sz w:val="19"/>
               </w:rPr>
-              <w:t>Préserver les copies qualifiées et en reprendre une fraîche avant activation</w:t>
+              <w:t>Préserver les copies qualifiées et la sauvegarde propre à la production</w:t>
             </w:r>
           </w:p>
         </w:tc>
@@ -5332,7 +5349,7 @@
                 <w:color w:val="000000"/>
                 <w:sz w:val="19"/>
               </w:rPr>
-              <w:t>Répétition isolée et contrôle de passage fondé sur les preuves réelles</w:t>
+              <w:t>Répétition isolée et contrôles fondés sur les preuves réelles</w:t>
             </w:r>
           </w:p>
         </w:tc>
@@ -5350,24 +5367,7 @@
           <w:b w:val="0"/>
           <w:color w:val="000000"/>
         </w:rPr>
-        <w:t xml:space="preserve">Le </w:t>
-      </w:r>
-      <w:hyperlink r:id="rId11">
-        <w:r>
-          <w:rPr>
-            <w:color w:val="1D4E63"/>
-            <w:u w:val="single"/>
-          </w:rPr>
-          <w:t>dossier de production</w:t>
-        </w:r>
-      </w:hyperlink>
-      <w:r>
-        <w:rPr>
-          <w:rFonts w:ascii="Arial" w:hAnsi="Arial"/>
-          <w:b w:val="0"/>
-          <w:color w:val="000000"/>
-        </w:rPr>
-        <w:t xml:space="preserve"> conserve l’avancement et la prochaine action. Le plan CIL reste une proposition pour l’itération suivante.</w:t>
+        <w:t>L’exécution et ses éventuels blocages restent suivis dans leur périmètre propre. Le plan CIL constitue une proposition pour l’itération suivante.</w:t>
       </w:r>
     </w:p>
     <w:p>

</xml_diff>